<commit_message>
Commit from localApi 1
</commit_message>
<xml_diff>
--- a/Details-Python-Api.docx
+++ b/Details-Python-Api.docx
@@ -4,21 +4,8 @@
   <w:body>
     <w:p>
       <w:r>
-        <w:t xml:space="preserve">pip install </w:t>
-      </w:r>
-      <w:proofErr w:type="spellStart"/>
-      <w:r>
-        <w:t>fastapi</w:t>
-      </w:r>
-      <w:proofErr w:type="spellEnd"/>
-      <w:r>
-        <w:t xml:space="preserve"> </w:t>
-      </w:r>
-      <w:proofErr w:type="spellStart"/>
-      <w:r>
-        <w:t>uvicorn</w:t>
-      </w:r>
-      <w:proofErr w:type="spellEnd"/>
+        <w:t>pip install fastapi uvicorn</w:t>
+      </w:r>
     </w:p>
     <w:p/>
     <w:p>
@@ -42,15 +29,7 @@
         <w:t>▼</w:t>
       </w:r>
       <w:r>
-        <w:t xml:space="preserve"> (Served from Local AWS S3 via </w:t>
-      </w:r>
-      <w:proofErr w:type="spellStart"/>
-      <w:r>
-        <w:t>Floci</w:t>
-      </w:r>
-      <w:proofErr w:type="spellEnd"/>
-      <w:r>
-        <w:t xml:space="preserve"> on Port 4566)</w:t>
+        <w:t xml:space="preserve"> (Served from Local AWS S3 via Floci on Port 4566)</w:t>
       </w:r>
     </w:p>
     <w:p>
@@ -79,15 +58,7 @@
     </w:p>
     <w:p>
       <w:r>
-        <w:t xml:space="preserve">    [ </w:t>
-      </w:r>
-      <w:proofErr w:type="spellStart"/>
-      <w:r>
-        <w:t>FastAPI</w:t>
-      </w:r>
-      <w:proofErr w:type="spellEnd"/>
-      <w:r>
-        <w:t xml:space="preserve"> Backend API Engine on Port 8000 ]</w:t>
+        <w:t xml:space="preserve">    [ FastAPI Backend API Engine on Port 8000 ]</w:t>
       </w:r>
     </w:p>
     <w:p>
@@ -111,15 +82,7 @@
     </w:p>
     <w:p>
       <w:r>
-        <w:t xml:space="preserve">    [ </w:t>
-      </w:r>
-      <w:proofErr w:type="spellStart"/>
-      <w:r>
-        <w:t>Pydantic</w:t>
-      </w:r>
-      <w:proofErr w:type="spellEnd"/>
-      <w:r>
-        <w:t xml:space="preserve"> v2 Model Verification Layer ]</w:t>
+        <w:t xml:space="preserve">    [ Pydantic v2 Model Verification Layer ]</w:t>
       </w:r>
     </w:p>
     <w:p>
@@ -138,28 +101,12 @@
         <w:t>▼</w:t>
       </w:r>
       <w:r>
-        <w:t xml:space="preserve"> (</w:t>
-      </w:r>
-      <w:proofErr w:type="spellStart"/>
-      <w:r>
-        <w:t>pyodbc</w:t>
-      </w:r>
-      <w:proofErr w:type="spellEnd"/>
-      <w:r>
-        <w:t xml:space="preserve"> Driver Communication Layer)</w:t>
-      </w:r>
-    </w:p>
-    <w:p>
-      <w:r>
-        <w:t xml:space="preserve">[ Relational Engine: MS SQL Server </w:t>
-      </w:r>
-      <w:proofErr w:type="spellStart"/>
-      <w:r>
-        <w:t>LocalDB</w:t>
-      </w:r>
-      <w:proofErr w:type="spellEnd"/>
-      <w:r>
-        <w:t xml:space="preserve"> Instance ]</w:t>
+        <w:t xml:space="preserve"> (pyodbc Driver Communication Layer)</w:t>
+      </w:r>
+    </w:p>
+    <w:p>
+      <w:r>
+        <w:t>[ Relational Engine: MS SQL Server LocalDB Instance ]</w:t>
       </w:r>
     </w:p>
     <w:p/>
@@ -226,13 +173,8 @@
           <w:numId w:val="1"/>
         </w:numPr>
       </w:pPr>
-      <w:proofErr w:type="spellStart"/>
-      <w:r>
-        <w:t>floci</w:t>
-      </w:r>
-      <w:proofErr w:type="spellEnd"/>
-      <w:r>
-        <w:t xml:space="preserve"> start</w:t>
+      <w:r>
+        <w:t>floci start</w:t>
       </w:r>
     </w:p>
     <w:p>
@@ -311,21 +253,8 @@
       </w:r>
     </w:p>
     <w:p>
-      <w:proofErr w:type="spellStart"/>
-      <w:r>
-        <w:t>aws</w:t>
-      </w:r>
-      <w:proofErr w:type="spellEnd"/>
-      <w:r>
-        <w:t xml:space="preserve"> s3 mb s3://employee-dashboard --endpoint-</w:t>
-      </w:r>
-      <w:proofErr w:type="spellStart"/>
-      <w:r>
-        <w:t>url</w:t>
-      </w:r>
-      <w:proofErr w:type="spellEnd"/>
-      <w:r>
-        <w:t>=http://localhost:4566 --region us-east-1</w:t>
+      <w:r>
+        <w:t>aws s3 mb s3://employee-dashboard --endpoint-url=http://localhost:4566 --region us-east-1</w:t>
       </w:r>
     </w:p>
     <w:p>
@@ -340,41 +269,12 @@
           <w:b/>
           <w:bCs/>
         </w:rPr>
-        <w:t xml:space="preserve">Copy the app.html file right into </w:t>
-      </w:r>
-      <w:proofErr w:type="spellStart"/>
-      <w:r>
-        <w:rPr>
-          <w:b/>
-          <w:bCs/>
-        </w:rPr>
-        <w:t>Floci's</w:t>
-      </w:r>
-      <w:proofErr w:type="spellEnd"/>
-      <w:r>
-        <w:rPr>
-          <w:b/>
-          <w:bCs/>
-        </w:rPr>
-        <w:t xml:space="preserve"> emulated storage block:</w:t>
-      </w:r>
-    </w:p>
-    <w:p>
-      <w:proofErr w:type="spellStart"/>
-      <w:r>
-        <w:t>aws</w:t>
-      </w:r>
-      <w:proofErr w:type="spellEnd"/>
-      <w:r>
-        <w:t xml:space="preserve"> s3 cp app.html s3://employee-dashboard/index.html --endpoint-</w:t>
-      </w:r>
-      <w:proofErr w:type="spellStart"/>
-      <w:r>
-        <w:t>url</w:t>
-      </w:r>
-      <w:proofErr w:type="spellEnd"/>
-      <w:r>
-        <w:t>=http://localhost:4566</w:t>
+        <w:t>Copy the app.html file right into Floci's emulated storage block:</w:t>
+      </w:r>
+    </w:p>
+    <w:p>
+      <w:r>
+        <w:t>aws s3 cp app.html s3://employee-dashboard/index.html --endpoint-url=http://localhost:4566</w:t>
       </w:r>
     </w:p>
     <w:p>
@@ -441,110 +341,42 @@
     </w:p>
     <w:p>
       <w:r>
-        <w:t xml:space="preserve">Primary Key Locks: Ensure that during edit transitions, the UI script invokes .disabled = true on the </w:t>
-      </w:r>
-      <w:proofErr w:type="spellStart"/>
-      <w:r>
-        <w:t>empcode</w:t>
-      </w:r>
-      <w:proofErr w:type="spellEnd"/>
-      <w:r>
-        <w:t xml:space="preserve"> field to preserve relational consistency.</w:t>
-      </w:r>
-    </w:p>
-    <w:p>
-      <w:r>
-        <w:t xml:space="preserve">XSS Neutralization: The @field_validator regex function safely catches and strips structural symbols (&lt;...?&gt;), stripping malicious </w:t>
-      </w:r>
-      <w:proofErr w:type="spellStart"/>
-      <w:r>
-        <w:t>javascript</w:t>
-      </w:r>
-      <w:proofErr w:type="spellEnd"/>
-      <w:r>
-        <w:t xml:space="preserve"> vectors before they can be saved to SQL.</w:t>
-      </w:r>
-    </w:p>
-    <w:p>
-      <w:r>
-        <w:t xml:space="preserve">CORS Realignment: When executing public production builds on real cloud instances, restrict the </w:t>
-      </w:r>
-      <w:proofErr w:type="spellStart"/>
-      <w:r>
-        <w:t>allow_origins</w:t>
-      </w:r>
-      <w:proofErr w:type="spellEnd"/>
-      <w:r>
-        <w:t>=["*"] to your exact hosting domain layout to harden endpoints.</w:t>
-      </w:r>
-    </w:p>
-    <w:p/>
-    <w:p/>
-    <w:p>
-      <w:r>
-        <w:t xml:space="preserve">To deploy </w:t>
-      </w:r>
-      <w:proofErr w:type="spellStart"/>
-      <w:r>
-        <w:t>floci</w:t>
-      </w:r>
-      <w:proofErr w:type="spellEnd"/>
-      <w:r>
-        <w:t xml:space="preserve">-azure </w:t>
-      </w:r>
-    </w:p>
-    <w:p>
-      <w:r>
-        <w:t xml:space="preserve">pip install </w:t>
-      </w:r>
-      <w:proofErr w:type="spellStart"/>
-      <w:r>
-        <w:t>sqlalchemy</w:t>
-      </w:r>
-      <w:proofErr w:type="spellEnd"/>
-    </w:p>
-    <w:p/>
-    <w:p>
-      <w:proofErr w:type="spellStart"/>
-      <w:r>
-        <w:t>floci</w:t>
-      </w:r>
-      <w:proofErr w:type="spellEnd"/>
-      <w:r>
-        <w:t xml:space="preserve"> </w:t>
-      </w:r>
-      <w:proofErr w:type="spellStart"/>
-      <w:r>
-        <w:t>az</w:t>
-      </w:r>
-      <w:proofErr w:type="spellEnd"/>
-      <w:r>
-        <w:t xml:space="preserve"> start </w:t>
-      </w:r>
-    </w:p>
-    <w:p/>
-    <w:p>
-      <w:proofErr w:type="spellStart"/>
-      <w:r>
-        <w:t>Introuducing</w:t>
-      </w:r>
-      <w:proofErr w:type="spellEnd"/>
-      <w:r>
-        <w:t xml:space="preserve"> </w:t>
-      </w:r>
-      <w:proofErr w:type="spellStart"/>
-      <w:r>
-        <w:t>yaml</w:t>
-      </w:r>
-      <w:proofErr w:type="spellEnd"/>
-      <w:r>
-        <w:t xml:space="preserve"> file docker-</w:t>
-      </w:r>
-      <w:proofErr w:type="spellStart"/>
-      <w:r>
-        <w:t>compose.yml</w:t>
-      </w:r>
-      <w:proofErr w:type="spellEnd"/>
+        <w:t>Primary Key Locks: Ensure that during edit transitions, the UI script invokes .disabled = true on the empcode field to preserve relational consistency.</w:t>
+      </w:r>
+    </w:p>
+    <w:p>
+      <w:r>
+        <w:t>XSS Neutralization: The @field_validator regex function safely catches and strips structural symbols (&lt;...?&gt;), stripping malicious javascript vectors before they can be saved to SQL.</w:t>
+      </w:r>
+    </w:p>
+    <w:p>
+      <w:r>
+        <w:t>CORS Realignment: When executing public production builds on real cloud instances, restrict the allow_origins=["*"] to your exact hosting domain layout to harden endpoints.</w:t>
+      </w:r>
+    </w:p>
+    <w:p/>
+    <w:p/>
+    <w:p>
+      <w:r>
+        <w:t xml:space="preserve">To deploy floci-azure </w:t>
+      </w:r>
+    </w:p>
+    <w:p>
+      <w:r>
+        <w:t>pip install sqlalchemy</w:t>
+      </w:r>
+    </w:p>
+    <w:p/>
+    <w:p>
+      <w:r>
+        <w:t xml:space="preserve">floci az start </w:t>
+      </w:r>
+    </w:p>
+    <w:p/>
+    <w:p>
+      <w:r>
+        <w:t>Introuducing yaml file docker-compose.yml</w:t>
+      </w:r>
     </w:p>
     <w:p/>
     <w:p/>
@@ -562,25 +394,15 @@
       <w:r>
         <w:t xml:space="preserve"> </w:t>
       </w:r>
-      <w:proofErr w:type="spellStart"/>
-      <w:r>
-        <w:t>aws</w:t>
-      </w:r>
-      <w:proofErr w:type="spellEnd"/>
-      <w:r>
-        <w:t xml:space="preserve"> </w:t>
-      </w:r>
-      <w:proofErr w:type="spellStart"/>
-      <w:r>
-        <w:t>ecr</w:t>
-      </w:r>
-      <w:proofErr w:type="spellEnd"/>
-      <w:r>
-        <w:t xml:space="preserve"> get-login-password --region us-east-1 | docker login --username AWS --password-stdin 355033546958.dkr.ecr.us-east-1.amazonaws.com</w:t>
-      </w:r>
-    </w:p>
-    <w:p>
-      <w:r>
+      <w:r>
+        <w:t>aws ecr get-login-password --region us-east-1 | docker login --username AWS --password-stdin 355033546958.dkr.ecr.us-east-1.amazonaws.com</w:t>
+      </w:r>
+    </w:p>
+    <w:p>
+      <w:r>
+        <w:rPr>
+          <w:noProof/>
+        </w:rPr>
         <w:drawing>
           <wp:inline distT="0" distB="0" distL="0" distR="0" wp14:anchorId="1FDFF9CA" wp14:editId="3E726BD2">
             <wp:extent cx="5731510" cy="615950"/>
@@ -632,15 +454,7 @@
         <w:t xml:space="preserve"> </w:t>
       </w:r>
       <w:r>
-        <w:t xml:space="preserve">docker build -t </w:t>
-      </w:r>
-      <w:proofErr w:type="spellStart"/>
-      <w:r>
-        <w:t>python-cloud-api:latest</w:t>
-      </w:r>
-      <w:proofErr w:type="spellEnd"/>
-      <w:r>
-        <w:t xml:space="preserve"> .</w:t>
+        <w:t>docker build -t python-cloud-api:latest .</w:t>
       </w:r>
     </w:p>
     <w:p>
@@ -648,10 +462,7 @@
         <w:t xml:space="preserve"> </w:t>
       </w:r>
       <w:r>
-        <w:t xml:space="preserve">Step </w:t>
-      </w:r>
-      <w:r>
-        <w:t>2</w:t>
+        <w:t>Step 2</w:t>
       </w:r>
       <w:r>
         <w:sym w:font="Wingdings" w:char="F0E0"/>
@@ -662,21 +473,19 @@
       <w:r>
         <w:t xml:space="preserve">docker tag </w:t>
       </w:r>
-      <w:proofErr w:type="spellStart"/>
       <w:r>
         <w:t>api</w:t>
       </w:r>
       <w:r>
-        <w:t>:latest</w:t>
-      </w:r>
-      <w:proofErr w:type="spellEnd"/>
-      <w:r>
-        <w:t xml:space="preserve"> ://amazonaws.com</w:t>
-      </w:r>
-    </w:p>
-    <w:p/>
-    <w:p>
-      <w:r>
+        <w:t>:latest ://amazonaws.com</w:t>
+      </w:r>
+    </w:p>
+    <w:p/>
+    <w:p>
+      <w:r>
+        <w:rPr>
+          <w:noProof/>
+        </w:rPr>
         <w:drawing>
           <wp:inline distT="0" distB="0" distL="0" distR="0" wp14:anchorId="3BE43B25" wp14:editId="041D7911">
             <wp:extent cx="5731510" cy="2610485"/>
@@ -716,6 +525,9 @@
     </w:p>
     <w:p>
       <w:r>
+        <w:rPr>
+          <w:noProof/>
+        </w:rPr>
         <w:drawing>
           <wp:inline distT="0" distB="0" distL="0" distR="0" wp14:anchorId="7FE8C5DD" wp14:editId="2019361F">
             <wp:extent cx="5731510" cy="2042160"/>
@@ -760,14 +572,9 @@
     <w:p/>
     <w:p/>
     <w:p>
-      <w:proofErr w:type="spellStart"/>
       <w:r>
         <w:lastRenderedPageBreak/>
-        <w:t>Hre</w:t>
-      </w:r>
-      <w:proofErr w:type="spellEnd"/>
-      <w:r>
-        <w:t xml:space="preserve"> .. docker URI has been copied</w:t>
+        <w:t>Hre .. docker URI has been copied</w:t>
       </w:r>
     </w:p>
     <w:p>
@@ -777,44 +584,145 @@
     </w:p>
     <w:p>
       <w:r>
-        <w:t xml:space="preserve">docker tag </w:t>
-      </w:r>
-      <w:proofErr w:type="spellStart"/>
-      <w:r>
-        <w:t>python-cloud-api:latest</w:t>
-      </w:r>
-      <w:proofErr w:type="spellEnd"/>
-      <w:r>
-        <w:t xml:space="preserve"> 355033546958.dkr.ecr.us-east-1.amazonaws.com/python-cloud-</w:t>
-      </w:r>
-      <w:proofErr w:type="spellStart"/>
-      <w:r>
-        <w:t>api</w:t>
-      </w:r>
-      <w:proofErr w:type="spellEnd"/>
-    </w:p>
-    <w:p>
-      <w:proofErr w:type="spellStart"/>
-      <w:r>
-        <w:t>sTep</w:t>
-      </w:r>
-      <w:proofErr w:type="spellEnd"/>
-      <w:r>
-        <w:t xml:space="preserve"> 2</w:t>
-      </w:r>
-    </w:p>
-    <w:p>
-      <w:r>
-        <w:t>docker push 355033546958.dkr.ecr.us-east-1.amazonaws.com/python-cloud-</w:t>
-      </w:r>
-      <w:proofErr w:type="spellStart"/>
-      <w:r>
-        <w:t>api</w:t>
-      </w:r>
-      <w:proofErr w:type="spellEnd"/>
-    </w:p>
-    <w:p/>
-    <w:p/>
+        <w:t>docker tag python-cloud-api:latest 355033546958.dkr.ecr.us-east-1.amazonaws.com/python-cloud-api</w:t>
+      </w:r>
+    </w:p>
+    <w:p>
+      <w:r>
+        <w:t>sTep 2</w:t>
+      </w:r>
+    </w:p>
+    <w:p>
+      <w:r>
+        <w:t>docker push 355033546958.dkr.ecr.us-east-1.amazonaws.com/python-cloud-api</w:t>
+      </w:r>
+    </w:p>
+    <w:p>
+      <w:pPr>
+        <w:rPr>
+          <w:b/>
+          <w:bCs/>
+        </w:rPr>
+      </w:pPr>
+      <w:r>
+        <w:rPr>
+          <w:b/>
+          <w:bCs/>
+        </w:rPr>
+        <w:t>Now the image has been created</w:t>
+      </w:r>
+    </w:p>
+    <w:p>
+      <w:r>
+        <w:rPr>
+          <w:noProof/>
+        </w:rPr>
+        <w:drawing>
+          <wp:inline distT="0" distB="0" distL="0" distR="0" wp14:anchorId="71002CE4" wp14:editId="25DB00F7">
+            <wp:extent cx="5731510" cy="2633345"/>
+            <wp:effectExtent l="0" t="0" r="2540" b="0"/>
+            <wp:docPr id="1790322259" name="Picture 1"/>
+            <wp:cNvGraphicFramePr>
+              <a:graphicFrameLocks xmlns:a="http://schemas.openxmlformats.org/drawingml/2006/main" noChangeAspect="1"/>
+            </wp:cNvGraphicFramePr>
+            <a:graphic xmlns:a="http://schemas.openxmlformats.org/drawingml/2006/main">
+              <a:graphicData uri="http://schemas.openxmlformats.org/drawingml/2006/picture">
+                <pic:pic xmlns:pic="http://schemas.openxmlformats.org/drawingml/2006/picture">
+                  <pic:nvPicPr>
+                    <pic:cNvPr id="1790322259" name=""/>
+                    <pic:cNvPicPr/>
+                  </pic:nvPicPr>
+                  <pic:blipFill>
+                    <a:blip r:embed="rId11"/>
+                    <a:stretch>
+                      <a:fillRect/>
+                    </a:stretch>
+                  </pic:blipFill>
+                  <pic:spPr>
+                    <a:xfrm>
+                      <a:off x="0" y="0"/>
+                      <a:ext cx="5731510" cy="2633345"/>
+                    </a:xfrm>
+                    <a:prstGeom prst="rect">
+                      <a:avLst/>
+                    </a:prstGeom>
+                  </pic:spPr>
+                </pic:pic>
+              </a:graphicData>
+            </a:graphic>
+          </wp:inline>
+        </w:drawing>
+      </w:r>
+    </w:p>
+    <w:p>
+      <w:r>
+        <w:t>https://apinode1-pxx4.onrender.com/</w:t>
+      </w:r>
+    </w:p>
+    <w:p>
+      <w:pPr>
+        <w:pStyle w:val="ListParagraph"/>
+        <w:numPr>
+          <w:ilvl w:val="0"/>
+          <w:numId w:val="2"/>
+        </w:numPr>
+        <w:rPr>
+          <w:highlight w:val="yellow"/>
+        </w:rPr>
+      </w:pPr>
+      <w:hyperlink r:id="rId12" w:tgtFrame="_blank" w:history="1">
+        <w:r>
+          <w:rPr>
+            <w:rStyle w:val="Hyperlink"/>
+            <w:highlight w:val="yellow"/>
+          </w:rPr>
+          <w:t>Render</w:t>
+        </w:r>
+      </w:hyperlink>
+    </w:p>
+    <w:p>
+      <w:pPr>
+        <w:pStyle w:val="ListParagraph"/>
+        <w:numPr>
+          <w:ilvl w:val="0"/>
+          <w:numId w:val="2"/>
+        </w:numPr>
+      </w:pPr>
+      <w:r>
+        <w:t xml:space="preserve">Create a free account at </w:t>
+      </w:r>
+      <w:hyperlink r:id="rId13" w:tgtFrame="_blank" w:history="1">
+        <w:r>
+          <w:rPr>
+            <w:rStyle w:val="Hyperlink"/>
+          </w:rPr>
+          <w:t>huggingface.co</w:t>
+        </w:r>
+      </w:hyperlink>
+      <w:r>
+        <w:t>.</w:t>
+      </w:r>
+    </w:p>
+    <w:p>
+      <w:r>
+        <w:t>Agnostic Container Pattern: Your lightweight Dockerfile compiles in seconds and can seamlessly deploy to AWS App Runner, Azure App Services, or Render without code modification.</w:t>
+      </w:r>
+    </w:p>
+    <w:p>
+      <w:r>
+        <w:t>Smart Database Layer: Your app.py switches dynamically. It runs locally via floci containers, uses zero-configuration shared memory slots in free tiers, and links to production enterprise data servers on demand.</w:t>
+      </w:r>
+    </w:p>
+    <w:p>
+      <w:r>
+        <w:t>Sealed Frontend Logic: Your app.html utilizes modern async/await syntax to ensure resilient cross-origin client fetching.</w:t>
+      </w:r>
+    </w:p>
+    <w:p>
+      <w:r>
+        <w:t>You can now use this exact architecture pattern as a verified template for any future Python cloud-native APIs you design!</w:t>
+      </w:r>
+    </w:p>
     <w:sectPr>
       <w:pgSz w:w="11906" w:h="16838"/>
       <w:pgMar w:top="1440" w:right="1440" w:bottom="1440" w:left="1440" w:header="708" w:footer="708" w:gutter="0"/>
@@ -916,8 +824,97 @@
       </w:pPr>
     </w:lvl>
   </w:abstractNum>
+  <w:abstractNum w:abstractNumId="1" w15:restartNumberingAfterBreak="0">
+    <w:nsid w:val="14EE1379"/>
+    <w:multiLevelType w:val="hybridMultilevel"/>
+    <w:tmpl w:val="6F7099BE"/>
+    <w:lvl w:ilvl="0" w:tplc="4009000F">
+      <w:start w:val="1"/>
+      <w:numFmt w:val="decimal"/>
+      <w:lvlText w:val="%1."/>
+      <w:lvlJc w:val="left"/>
+      <w:pPr>
+        <w:ind w:left="720" w:hanging="360"/>
+      </w:pPr>
+    </w:lvl>
+    <w:lvl w:ilvl="1" w:tplc="40090019" w:tentative="1">
+      <w:start w:val="1"/>
+      <w:numFmt w:val="lowerLetter"/>
+      <w:lvlText w:val="%2."/>
+      <w:lvlJc w:val="left"/>
+      <w:pPr>
+        <w:ind w:left="1440" w:hanging="360"/>
+      </w:pPr>
+    </w:lvl>
+    <w:lvl w:ilvl="2" w:tplc="4009001B" w:tentative="1">
+      <w:start w:val="1"/>
+      <w:numFmt w:val="lowerRoman"/>
+      <w:lvlText w:val="%3."/>
+      <w:lvlJc w:val="right"/>
+      <w:pPr>
+        <w:ind w:left="2160" w:hanging="180"/>
+      </w:pPr>
+    </w:lvl>
+    <w:lvl w:ilvl="3" w:tplc="4009000F" w:tentative="1">
+      <w:start w:val="1"/>
+      <w:numFmt w:val="decimal"/>
+      <w:lvlText w:val="%4."/>
+      <w:lvlJc w:val="left"/>
+      <w:pPr>
+        <w:ind w:left="2880" w:hanging="360"/>
+      </w:pPr>
+    </w:lvl>
+    <w:lvl w:ilvl="4" w:tplc="40090019" w:tentative="1">
+      <w:start w:val="1"/>
+      <w:numFmt w:val="lowerLetter"/>
+      <w:lvlText w:val="%5."/>
+      <w:lvlJc w:val="left"/>
+      <w:pPr>
+        <w:ind w:left="3600" w:hanging="360"/>
+      </w:pPr>
+    </w:lvl>
+    <w:lvl w:ilvl="5" w:tplc="4009001B" w:tentative="1">
+      <w:start w:val="1"/>
+      <w:numFmt w:val="lowerRoman"/>
+      <w:lvlText w:val="%6."/>
+      <w:lvlJc w:val="right"/>
+      <w:pPr>
+        <w:ind w:left="4320" w:hanging="180"/>
+      </w:pPr>
+    </w:lvl>
+    <w:lvl w:ilvl="6" w:tplc="4009000F" w:tentative="1">
+      <w:start w:val="1"/>
+      <w:numFmt w:val="decimal"/>
+      <w:lvlText w:val="%7."/>
+      <w:lvlJc w:val="left"/>
+      <w:pPr>
+        <w:ind w:left="5040" w:hanging="360"/>
+      </w:pPr>
+    </w:lvl>
+    <w:lvl w:ilvl="7" w:tplc="40090019" w:tentative="1">
+      <w:start w:val="1"/>
+      <w:numFmt w:val="lowerLetter"/>
+      <w:lvlText w:val="%8."/>
+      <w:lvlJc w:val="left"/>
+      <w:pPr>
+        <w:ind w:left="5760" w:hanging="360"/>
+      </w:pPr>
+    </w:lvl>
+    <w:lvl w:ilvl="8" w:tplc="4009001B" w:tentative="1">
+      <w:start w:val="1"/>
+      <w:numFmt w:val="lowerRoman"/>
+      <w:lvlText w:val="%9."/>
+      <w:lvlJc w:val="right"/>
+      <w:pPr>
+        <w:ind w:left="6480" w:hanging="180"/>
+      </w:pPr>
+    </w:lvl>
+  </w:abstractNum>
   <w:num w:numId="1" w16cid:durableId="1147287925">
     <w:abstractNumId w:val="0"/>
+  </w:num>
+  <w:num w:numId="2" w16cid:durableId="1388146712">
+    <w:abstractNumId w:val="1"/>
   </w:num>
 </w:numbering>
 </file>
@@ -1525,6 +1522,7 @@
   <w:style w:type="character" w:default="1" w:styleId="DefaultParagraphFont">
     <w:name w:val="Default Paragraph Font"/>
     <w:uiPriority w:val="1"/>
+    <w:semiHidden/>
     <w:unhideWhenUsed/>
   </w:style>
   <w:style w:type="table" w:default="1" w:styleId="TableNormal">

</xml_diff>